<commit_message>
docs: link v1.0.0 APK release asset
</commit_message>
<xml_diff>
--- a/docs/docx/DOKUMENTASI-TEKNIS.docx
+++ b/docs/docx/DOKUMENTASI-TEKNIS.docx
@@ -1865,6 +1865,42 @@
                 <w:sz w:val="19"/>
               </w:rPr>
               <w:t>INTERNET</w:t>
+            </w:r>
+          </w:p>
+        </w:tc>
+      </w:tr>
+      <w:tr>
+        <w:tc>
+          <w:tcPr>
+            <w:tcW w:type="dxa" w:w="4824"/>
+          </w:tcPr>
+          <w:p>
+            <w:pPr>
+              <w:spacing w:after="0"/>
+            </w:pPr>
+            <w:r>
+              <w:rPr>
+                <w:b w:val="0"/>
+                <w:sz w:val="19"/>
+              </w:rPr>
+              <w:t>Aset rilis</w:t>
+            </w:r>
+          </w:p>
+        </w:tc>
+        <w:tc>
+          <w:tcPr>
+            <w:tcW w:type="dxa" w:w="4824"/>
+          </w:tcPr>
+          <w:p>
+            <w:pPr>
+              <w:spacing w:after="0"/>
+            </w:pPr>
+            <w:r>
+              <w:rPr>
+                <w:b w:val="0"/>
+                <w:sz w:val="19"/>
+              </w:rPr>
+              <w:t>&lt;https://github.com/farrelfaiziaulhaq/payloadhub-ai/releases/tag/v1.0.0&gt;</w:t>
             </w:r>
           </w:p>
         </w:tc>

</xml_diff>

<commit_message>
docs: add single combined final report (Markdown + Word)
</commit_message>
<xml_diff>
--- a/docs/docx/DOKUMENTASI-TEKNIS.docx
+++ b/docs/docx/DOKUMENTASI-TEKNIS.docx
@@ -1897,10 +1897,11 @@
             </w:pPr>
             <w:r>
               <w:rPr>
-                <w:b w:val="0"/>
+                <w:color w:val="1A4F8B"/>
                 <w:sz w:val="19"/>
+                <w:u w:val="single"/>
               </w:rPr>
-              <w:t>&lt;https://github.com/farrelfaiziaulhaq/payloadhub-ai/releases/tag/v1.0.0&gt;</w:t>
+              <w:t>https://github.com/farrelfaiziaulhaq/payloadhub-ai/releases/tag/v1.0.0</w:t>
             </w:r>
           </w:p>
         </w:tc>

</xml_diff>

<commit_message>
feat: mobile-first UI and real app screenshots
- new mobile app header, greeting hero, quick tools and circular FAB

- responsive generator tabs, monitoring filters, settings and exploit cards

- 8 screenshots at 390x844 captured from the running Flutter build

- combined Word report now embeds screenshots and implementation discussion

- rebuilt release APK (55,5 MB) and refreshed v1.0.0 asset
</commit_message>
<xml_diff>
--- a/docs/docx/DOKUMENTASI-TEKNIS.docx
+++ b/docs/docx/DOKUMENTASI-TEKNIS.docx
@@ -1681,7 +1681,7 @@
                 <w:b w:val="0"/>
                 <w:sz w:val="19"/>
               </w:rPr>
-              <w:t>57.876.933 byte (55,2 MB)</w:t>
+              <w:t>58.156.477 byte (55,5 MB)</w:t>
             </w:r>
           </w:p>
         </w:tc>
@@ -1718,7 +1718,7 @@
                 <w:color w:val="9C270B"/>
                 <w:sz w:val="19"/>
               </w:rPr>
-              <w:t>7F71676147E77EA323B26D172C99F7BA30C3CF7C0B6252E06263EFDAB15B1479</w:t>
+              <w:t>3114C3AA027C19C6C3BA6FDC564AEF0EAC38062CE359C42F269089651C25811B</w:t>
             </w:r>
           </w:p>
         </w:tc>
@@ -5415,6 +5415,109 @@
     </w:p>
     <w:p>
       <w:pPr>
+        <w:pStyle w:val="Heading3"/>
+      </w:pPr>
+      <w:r>
+        <w:rPr>
+          <w:b/>
+          <w:color w:val="142B45"/>
+        </w:rPr>
+        <w:t>11.1 Membuat screenshot antarmuka</w:t>
+      </w:r>
+    </w:p>
+    <w:p>
+      <w:r>
+        <w:rPr>
+          <w:b w:val="0"/>
+        </w:rPr>
+        <w:t>Screenshot pada laporan diambil dari build web yang berjalan, bukan mockup:</w:t>
+      </w:r>
+    </w:p>
+    <w:p>
+      <w:pPr>
+        <w:spacing w:before="80" w:after="80"/>
+        <w:ind w:left="288"/>
+        <w:shd w:val="clear" w:color="auto" w:fill="F4F4F4"/>
+      </w:pPr>
+      <w:r>
+        <w:rPr>
+          <w:rFonts w:ascii="Consolas" w:hAnsi="Consolas"/>
+          <w:color w:val="1F1F1F"/>
+          <w:sz w:val="18"/>
+        </w:rPr>
+        <w:t>cd frontend</w:t>
+        <w:br/>
+        <w:t>flutter build web --release</w:t>
+        <w:br/>
+        <w:t>python -m http.server 8099 --bind 127.0.0.1 --directory build/web</w:t>
+      </w:r>
+    </w:p>
+    <w:p>
+      <w:r>
+        <w:rPr>
+          <w:b w:val="0"/>
+        </w:rPr>
+        <w:t xml:space="preserve">Buka </w:t>
+      </w:r>
+      <w:r>
+        <w:rPr>
+          <w:rFonts w:ascii="Consolas" w:hAnsi="Consolas"/>
+          <w:color w:val="9C270B"/>
+          <w:sz w:val="19"/>
+        </w:rPr>
+        <w:t>http://127.0.0.1:8099</w:t>
+      </w:r>
+      <w:r>
+        <w:rPr>
+          <w:b w:val="0"/>
+        </w:rPr>
+        <w:t xml:space="preserve"> dengan viewport </w:t>
+      </w:r>
+      <w:r>
+        <w:rPr>
+          <w:b/>
+        </w:rPr>
+        <w:t>390 × 844</w:t>
+      </w:r>
+      <w:r>
+        <w:rPr>
+          <w:b w:val="0"/>
+        </w:rPr>
+        <w:t>, lalu ambil</w:t>
+      </w:r>
+    </w:p>
+    <w:p>
+      <w:r>
+        <w:rPr>
+          <w:b w:val="0"/>
+        </w:rPr>
+        <w:t>tangkapan layar Dashboard, Generator, Exploit, Riwayat, Settings, dan</w:t>
+      </w:r>
+    </w:p>
+    <w:p>
+      <w:r>
+        <w:rPr>
+          <w:b w:val="0"/>
+        </w:rPr>
+        <w:t xml:space="preserve">Monitoring. Simpan sebagai PNG di </w:t>
+      </w:r>
+      <w:r>
+        <w:rPr>
+          <w:rFonts w:ascii="Consolas" w:hAnsi="Consolas"/>
+          <w:color w:val="9C270B"/>
+          <w:sz w:val="19"/>
+        </w:rPr>
+        <w:t>docs/assets/screenshots/</w:t>
+      </w:r>
+      <w:r>
+        <w:rPr>
+          <w:b w:val="0"/>
+        </w:rPr>
+        <w:t>.</w:t>
+      </w:r>
+    </w:p>
+    <w:p>
+      <w:pPr>
         <w:pStyle w:val="Heading2"/>
       </w:pPr>
       <w:r>

</xml_diff>